<commit_message>
Address review: value metric risk, GM caveat, A/B positioning
</commit_message>
<xml_diff>
--- a/day22_one_pager_template.docx
+++ b/day22_one_pager_template.docx
@@ -245,7 +245,7 @@
           <w:szCs w:val="20"/>
           <w:rtl w:val="0"/>
         </w:rPr>
-        <w:t>Ngân sách Nhân sự/Vận hành: tiền thay ca trực CSKH (~$450/tháng/người), không phải ngân sách phần mềm. Chủ shop SMB tự quyết, không qua IT/Procurement.</w:t>
+        <w:t>A (công cụ): "Nền tảng chatbot AI cho shop online" → ngân sách phần mềm, khách hỏi "cần thêm nền tảng nữa không?". B (thay việc): "Trực inbox 24/7 thay ca trực đêm, $0,45 mỗi hội thoại xong" → ngân sách Nhân sự/Vận hành, chủ shop tự ký duyệt.</w:t>
       </w:r>
       <w:r>
         <w:rPr>
@@ -268,7 +268,7 @@
           <w:szCs w:val="20"/>
           <w:rtl w:val="0"/>
         </w:rPr>
-        <w:t>Khách hỏi "rẻ hơn lương 1 người không?" chứ không hỏi "cần thêm nền tảng nữa không?".</w:t>
+        <w:t>Chọn B: khách so giá với lương ~$450/tháng của 1 người trực, không so với phần mềm khác.</w:t>
       </w:r>
       <w:r>
         <w:rPr>
@@ -383,7 +383,7 @@
           <w:szCs w:val="20"/>
           <w:rtl w:val="0"/>
         </w:rPr>
-        <w:t>Cả hai điểm sát ngưỡng 7, nên bằng chứng eval (Evidence Pack) là điều kiện để giữ Outcome.</w:t>
+        <w:t>Cả hai điểm sát ngưỡng 7, nên Evidence Pack là điều kiện để giữ Outcome. Rủi ro: SME VN quen trả theo gói/usage; dự phòng Hybrid (phí nền nhỏ + $/job).</w:t>
       </w:r>
       <w:r>
         <w:rPr>
@@ -1406,9 +1406,10 @@
       </w:pPr>
       <w:r>
         <w:rPr>
-          <w:rtl w:val="0"/>
-        </w:rPr>
-        <w:br/>
+          <w:sz w:val="18"/>
+          <w:rtl w:val="0"/>
+        </w:rPr>
+        <w:t>Lưu ý: GM 76,7% là GM trực tiếp (chưa gồm Overhead, S8 = 0), cao hơn benchmark 53–65%; sau overhead sẽ thấp hơn (1_Cost_Job!B67).</w:t>
       </w:r>
     </w:p>
     <w:p>

</xml_diff>